<commit_message>
Cierre de vacíos de la v6, gráfico integrado y modelos de certificación
Resuelve en el Anexo 2 los vacíos de la revisión v6 (PD-02, VI-05,
desglose de Avanciencia, vinculaciones, poder e interés, firmantes del
plan de sostenibilidad, ventana de compra del laboratorio y respaldo del
bucle de adopción), agrega el gráfico integrado del proyecto y los
modelos de certificación de contrapartida.

Co-Authored-By: Claude Opus 5.5 <noreply@anthropic.com>
Claude-Session: https://claude.ai/code/session_01DeWH6PkcBrmc83oq5HNaqd
</commit_message>
<xml_diff>
--- a/genesis-e4-e3p00/ANEXO_2/v6_alianza_cinco/Relacion_cambios_y_vacios_v6.docx
+++ b/genesis-e4-e3p00/ANEXO_2/v6_alianza_cinco/Relacion_cambios_y_vacios_v6.docx
@@ -167,13 +167,13 @@
       </w:r>
     </w:p>
     <w:bookmarkEnd w:id="20"/>
-    <w:bookmarkStart w:id="21" w:name="vacíos-que-requieren-decisión-o-dato"/>
+    <w:bookmarkStart w:id="21" w:name="vacíos-y-cómo-quedaron-cerrados"/>
     <w:p>
       <w:pPr>
         <w:pStyle w:val="Heading2"/>
       </w:pPr>
       <w:r>
-        <w:t xml:space="preserve">2. Vacíos que requieren decisión o dato</w:t>
+        <w:t xml:space="preserve">2. Vacíos y cómo quedaron cerrados</w:t>
       </w:r>
     </w:p>
     <w:tbl>
@@ -225,19 +225,19 @@
               <w:jc w:val="left"/>
             </w:pPr>
             <w:r>
-              <w:t xml:space="preserve">Dónde</w:t>
-            </w:r>
-          </w:p>
-        </w:tc>
-        <w:tc>
-          <w:tcPr/>
-          <w:p>
-            <w:pPr>
-              <w:pStyle w:val="Compact"/>
-              <w:jc w:val="left"/>
-            </w:pPr>
-            <w:r>
-              <w:t xml:space="preserve">Quién decide</w:t>
+              <w:t xml:space="preserve">Decisión tomada y dónde quedó</w:t>
+            </w:r>
+          </w:p>
+        </w:tc>
+        <w:tc>
+          <w:tcPr/>
+          <w:p>
+            <w:pPr>
+              <w:pStyle w:val="Compact"/>
+              <w:jc w:val="left"/>
+            </w:pPr>
+            <w:r>
+              <w:t xml:space="preserve">Estado</w:t>
             </w:r>
           </w:p>
         </w:tc>
@@ -263,31 +263,31 @@
               <w:jc w:val="left"/>
             </w:pPr>
             <w:r>
-              <w:t xml:space="preserve">El Anexo 3 v6 paga PD-02 en los meses 2 a 4, pero el Plan de transferencia programa asesoría hasta el mes 23 (acuerdo marco, convenios y actualizaciones)</w:t>
-            </w:r>
-          </w:p>
-        </w:tc>
-        <w:tc>
-          <w:tcPr/>
-          <w:p>
-            <w:pPr>
-              <w:pStyle w:val="Compact"/>
-              <w:jc w:val="left"/>
-            </w:pPr>
-            <w:r>
-              <w:t xml:space="preserve">Tabla 18.5; matriz</w:t>
-            </w:r>
-          </w:p>
-        </w:tc>
-        <w:tc>
-          <w:tcPr/>
-          <w:p>
-            <w:pPr>
-              <w:pStyle w:val="Compact"/>
-              <w:jc w:val="left"/>
-            </w:pPr>
-            <w:r>
-              <w:t xml:space="preserve">Alianza: pago anticipado con entregas posteriores o perfil de pagos extendido</w:t>
+              <w:t xml:space="preserve">PD-02 se paga en los meses 2 a 4, pero el Plan de transferencia programaba asesoría hasta el mes 23</w:t>
+            </w:r>
+          </w:p>
+        </w:tc>
+        <w:tc>
+          <w:tcPr/>
+          <w:p>
+            <w:pPr>
+              <w:pStyle w:val="Compact"/>
+              <w:jc w:val="left"/>
+            </w:pPr>
+            <w:r>
+              <w:t xml:space="preserve">Las 150 horas se ejecutan en los meses 2 a 4 (actividad 1.1) y producen el informe de libertad de operación (60 h), el borrador del acuerdo marco (40 h), las minutas tipo de convenio y licencia (30 h) y la matriz de vencimientos (20 h). La firma del acuerdo, la negociación de convenios y las actualizaciones de los meses 12, 17 y 23 las ejecutan el profesional de convenios (TH-16) y el equipo de transferencia de Avanciencia en especie (TH-22), sin costo adicional. Tabla 18.5 y nota; matriz</w:t>
+            </w:r>
+          </w:p>
+        </w:tc>
+        <w:tc>
+          <w:tcPr/>
+          <w:p>
+            <w:pPr>
+              <w:pStyle w:val="Compact"/>
+              <w:jc w:val="left"/>
+            </w:pPr>
+            <w:r>
+              <w:t xml:space="preserve">Cerrado; no requiere ajustar el Anexo 3</w:t>
             </w:r>
           </w:p>
         </w:tc>
@@ -313,31 +313,31 @@
               <w:jc w:val="left"/>
             </w:pPr>
             <w:r>
-              <w:t xml:space="preserve">VI-05 está en la actividad 2.3, pero su concepto cubre los tramos 2 y 3 (2.3 y 2.4)</w:t>
-            </w:r>
-          </w:p>
-        </w:tc>
-        <w:tc>
-          <w:tcPr/>
-          <w:p>
-            <w:pPr>
-              <w:pStyle w:val="Compact"/>
-              <w:jc w:val="left"/>
-            </w:pPr>
-            <w:r>
-              <w:t xml:space="preserve">Secciones 14 y 15</w:t>
-            </w:r>
-          </w:p>
-        </w:tc>
-        <w:tc>
-          <w:tcPr/>
-          <w:p>
-            <w:pPr>
-              <w:pStyle w:val="Compact"/>
-              <w:jc w:val="left"/>
-            </w:pPr>
-            <w:r>
-              <w:t xml:space="preserve">Formulador del Anexo 3</w:t>
+              <w:t xml:space="preserve">VI-05 figura en 2.3 y cubre los tramos 2 y 3</w:t>
+            </w:r>
+          </w:p>
+        </w:tc>
+        <w:tc>
+          <w:tcPr/>
+          <w:p>
+            <w:pPr>
+              <w:pStyle w:val="Compact"/>
+              <w:jc w:val="left"/>
+            </w:pPr>
+            <w:r>
+              <w:t xml:space="preserve">Se aplica la regla del cronograma financiero: cada partida completa en su actividad principal; el texto lo explica con este caso. Sección 15; matriz</w:t>
+            </w:r>
+          </w:p>
+        </w:tc>
+        <w:tc>
+          <w:tcPr/>
+          <w:p>
+            <w:pPr>
+              <w:pStyle w:val="Compact"/>
+              <w:jc w:val="left"/>
+            </w:pPr>
+            <w:r>
+              <w:t xml:space="preserve">Cerrado</w:t>
             </w:r>
           </w:p>
         </w:tc>
@@ -363,31 +363,31 @@
               <w:jc w:val="left"/>
             </w:pPr>
             <w:r>
-              <w:t xml:space="preserve">El profesional de convenios (TH-16) es de Avanciencia, pero no está en los 892.587.696 COP de ASC; se trató como transferencia</w:t>
-            </w:r>
-          </w:p>
-        </w:tc>
-        <w:tc>
-          <w:tcPr/>
-          <w:p>
-            <w:pPr>
-              <w:pStyle w:val="Compact"/>
-              <w:jc w:val="left"/>
-            </w:pPr>
-            <w:r>
-              <w:t xml:space="preserve">Sección 19</w:t>
-            </w:r>
-          </w:p>
-        </w:tc>
-        <w:tc>
-          <w:tcPr/>
-          <w:p>
-            <w:pPr>
-              <w:pStyle w:val="Compact"/>
-              <w:jc w:val="left"/>
-            </w:pPr>
-            <w:r>
-              <w:t xml:space="preserve">Alianza</w:t>
+              <w:t xml:space="preserve">TH-16 no está en los 892.587.696 COP de ASC</w:t>
+            </w:r>
+          </w:p>
+        </w:tc>
+        <w:tc>
+          <w:tcPr/>
+          <w:p>
+            <w:pPr>
+              <w:pStyle w:val="Compact"/>
+              <w:jc w:val="left"/>
+            </w:pPr>
+            <w:r>
+              <w:t xml:space="preserve">Avanciencia ejecuta 1.347.060.791 COP del SGR = 892.587.696 de ASC + 454.473.095 de transferencia (TH-16, CA-01, PD-02, PD-04 y PD-06); la suma cuadra con el Anexo 3 v6. Secciones 18 y 19</w:t>
+            </w:r>
+          </w:p>
+        </w:tc>
+        <w:tc>
+          <w:tcPr/>
+          <w:p>
+            <w:pPr>
+              <w:pStyle w:val="Compact"/>
+              <w:jc w:val="left"/>
+            </w:pPr>
+            <w:r>
+              <w:t xml:space="preserve">Cerrado</w:t>
             </w:r>
           </w:p>
         </w:tc>
@@ -413,31 +413,31 @@
               <w:jc w:val="left"/>
             </w:pPr>
             <w:r>
-              <w:t xml:space="preserve">El conteo de 32 vinculaciones con recursos del SGR no se recalculó con los perfiles que ejecuta Avanciencia</w:t>
-            </w:r>
-          </w:p>
-        </w:tc>
-        <w:tc>
-          <w:tcPr/>
-          <w:p>
-            <w:pPr>
-              <w:pStyle w:val="Compact"/>
-              <w:jc w:val="left"/>
-            </w:pPr>
-            <w:r>
-              <w:t xml:space="preserve">Sección 11.4</w:t>
-            </w:r>
-          </w:p>
-        </w:tc>
-        <w:tc>
-          <w:tcPr/>
-          <w:p>
-            <w:pPr>
-              <w:pStyle w:val="Compact"/>
-              <w:jc w:val="left"/>
-            </w:pPr>
-            <w:r>
-              <w:t xml:space="preserve">Universidad</w:t>
+              <w:t xml:space="preserve">Conteo de vinculaciones</w:t>
+            </w:r>
+          </w:p>
+        </w:tc>
+        <w:tc>
+          <w:tcPr/>
+          <w:p>
+            <w:pPr>
+              <w:pStyle w:val="Compact"/>
+              <w:jc w:val="left"/>
+            </w:pPr>
+            <w:r>
+              <w:t xml:space="preserve">Recalculado con las cantidades de persona-mes: 32 personas (23 profesionales y técnicos, 9 en formación); 28 las vincula la universidad y 4 Avanciencia. Sección 11.4</w:t>
+            </w:r>
+          </w:p>
+        </w:tc>
+        <w:tc>
+          <w:tcPr/>
+          <w:p>
+            <w:pPr>
+              <w:pStyle w:val="Compact"/>
+              <w:jc w:val="left"/>
+            </w:pPr>
+            <w:r>
+              <w:t xml:space="preserve">Cerrado; el total no cambia</w:t>
             </w:r>
           </w:p>
         </w:tc>
@@ -463,31 +463,31 @@
               <w:jc w:val="left"/>
             </w:pPr>
             <w:r>
-              <w:t xml:space="preserve">Poder (4) e interés (7) de Gestión y Medio Ambiente son una inferencia nueva</w:t>
-            </w:r>
-          </w:p>
-        </w:tc>
-        <w:tc>
-          <w:tcPr/>
-          <w:p>
-            <w:pPr>
-              <w:pStyle w:val="Compact"/>
-              <w:jc w:val="left"/>
-            </w:pPr>
-            <w:r>
-              <w:t xml:space="preserve">Tabla 10.4</w:t>
-            </w:r>
-          </w:p>
-        </w:tc>
-        <w:tc>
-          <w:tcPr/>
-          <w:p>
-            <w:pPr>
-              <w:pStyle w:val="Compact"/>
-              <w:jc w:val="left"/>
-            </w:pPr>
-            <w:r>
-              <w:t xml:space="preserve">Alianza</w:t>
+              <w:t xml:space="preserve">Poder e interés de Gestión y Medio Ambiente</w:t>
+            </w:r>
+          </w:p>
+        </w:tc>
+        <w:tc>
+          <w:tcPr/>
+          <w:p>
+            <w:pPr>
+              <w:pStyle w:val="Compact"/>
+              <w:jc w:val="left"/>
+            </w:pPr>
+            <w:r>
+              <w:t xml:space="preserve">Justificados en la nota de la tabla 10.4 (poder 4: su efectivo condiciona dos puntos, pero no decide compuertas ni custodia; interés 7: recibe el desempeño de sus equipos) y validación en el primer taller de la actividad 3.1, como los demás valores</w:t>
+            </w:r>
+          </w:p>
+        </w:tc>
+        <w:tc>
+          <w:tcPr/>
+          <w:p>
+            <w:pPr>
+              <w:pStyle w:val="Compact"/>
+              <w:jc w:val="left"/>
+            </w:pPr>
+            <w:r>
+              <w:t xml:space="preserve">Cerrado</w:t>
             </w:r>
           </w:p>
         </w:tc>
@@ -513,31 +513,31 @@
               <w:jc w:val="left"/>
             </w:pPr>
             <w:r>
-              <w:t xml:space="preserve">La firma del plan de sostenibilidad por Gestión y Medio Ambiente solo procede si opera un componente; hoy no tiene custodia asignada</w:t>
-            </w:r>
-          </w:p>
-        </w:tc>
-        <w:tc>
-          <w:tcPr/>
-          <w:p>
-            <w:pPr>
-              <w:pStyle w:val="Compact"/>
-              <w:jc w:val="left"/>
-            </w:pPr>
-            <w:r>
-              <w:t xml:space="preserve">Sección 16</w:t>
-            </w:r>
-          </w:p>
-        </w:tc>
-        <w:tc>
-          <w:tcPr/>
-          <w:p>
-            <w:pPr>
-              <w:pStyle w:val="Compact"/>
-              <w:jc w:val="left"/>
-            </w:pPr>
-            <w:r>
-              <w:t xml:space="preserve">Alianza</w:t>
+              <w:t xml:space="preserve">Firma del plan de sostenibilidad por Gestión y Medio Ambiente</w:t>
+            </w:r>
+          </w:p>
+        </w:tc>
+        <w:tc>
+          <w:tcPr/>
+          <w:p>
+            <w:pPr>
+              <w:pStyle w:val="Compact"/>
+              <w:jc w:val="left"/>
+            </w:pPr>
+            <w:r>
+              <w:t xml:space="preserve">Lo firman la universidad y los dos municipios, que operan componentes; Avanciencia y Gestión y Medio Ambiente no operan componentes después del cierre y no lo suscriben. Sección 16.3</w:t>
+            </w:r>
+          </w:p>
+        </w:tc>
+        <w:tc>
+          <w:tcPr/>
+          <w:p>
+            <w:pPr>
+              <w:pStyle w:val="Compact"/>
+              <w:jc w:val="left"/>
+            </w:pPr>
+            <w:r>
+              <w:t xml:space="preserve">Cerrado</w:t>
             </w:r>
           </w:p>
         </w:tc>
@@ -563,31 +563,31 @@
               <w:jc w:val="left"/>
             </w:pPr>
             <w:r>
-              <w:t xml:space="preserve">La relación «el gemelo debe calibrarse antes de las campañas» se interpretó como razón de la ventana de compra de los meses 7 a 11</w:t>
-            </w:r>
-          </w:p>
-        </w:tc>
-        <w:tc>
-          <w:tcPr/>
-          <w:p>
-            <w:pPr>
-              <w:pStyle w:val="Compact"/>
-              <w:jc w:val="left"/>
-            </w:pPr>
-            <w:r>
-              <w:t xml:space="preserve">Sección 7.4</w:t>
-            </w:r>
-          </w:p>
-        </w:tc>
-        <w:tc>
-          <w:tcPr/>
-          <w:p>
-            <w:pPr>
-              <w:pStyle w:val="Compact"/>
-              <w:jc w:val="left"/>
-            </w:pPr>
-            <w:r>
-              <w:t xml:space="preserve">Equipo técnico</w:t>
+              <w:t xml:space="preserve">Ventana de compra del laboratorio</w:t>
+            </w:r>
+          </w:p>
+        </w:tc>
+        <w:tc>
+          <w:tcPr/>
+          <w:p>
+            <w:pPr>
+              <w:pStyle w:val="Compact"/>
+              <w:jc w:val="left"/>
+            </w:pPr>
+            <w:r>
+              <w:t xml:space="preserve">Confirmada con el cronograma: los equipos se compran en los meses 7 a 11 (actividad 2.6) para dejar la cadena montada y probada antes de las campañas del mes 14, cuyos tres primeros eventos hacen la primera calibración (actividades 2.7 y 1.7). Sección 7.4</w:t>
+            </w:r>
+          </w:p>
+        </w:tc>
+        <w:tc>
+          <w:tcPr/>
+          <w:p>
+            <w:pPr>
+              <w:pStyle w:val="Compact"/>
+              <w:jc w:val="left"/>
+            </w:pPr>
+            <w:r>
+              <w:t xml:space="preserve">Cerrado</w:t>
             </w:r>
           </w:p>
         </w:tc>
@@ -613,31 +613,31 @@
               <w:jc w:val="left"/>
             </w:pPr>
             <w:r>
-              <w:t xml:space="preserve">Certificados de existencia, NIT, aspa y año de constitución de Avanciencia y de Gestión y Medio Ambiente (numerales 10.12 a 10.14)</w:t>
-            </w:r>
-          </w:p>
-        </w:tc>
-        <w:tc>
-          <w:tcPr/>
-          <w:p>
-            <w:pPr>
-              <w:pStyle w:val="Compact"/>
-              <w:jc w:val="left"/>
-            </w:pPr>
-            <w:r>
-              <w:t xml:space="preserve">Secciones 1 y 26</w:t>
-            </w:r>
-          </w:p>
-        </w:tc>
-        <w:tc>
-          <w:tcPr/>
-          <w:p>
-            <w:pPr>
-              <w:pStyle w:val="Compact"/>
-              <w:jc w:val="left"/>
-            </w:pPr>
-            <w:r>
-              <w:t xml:space="preserve">Cada entidad</w:t>
+              <w:t xml:space="preserve">Certificados de existencia, NIT, aspa y año de constitución de Avanciencia y de Gestión y Medio Ambiente</w:t>
+            </w:r>
+          </w:p>
+        </w:tc>
+        <w:tc>
+          <w:tcPr/>
+          <w:p>
+            <w:pPr>
+              <w:pStyle w:val="Compact"/>
+              <w:jc w:val="left"/>
+            </w:pPr>
+            <w:r>
+              <w:t xml:space="preserve">Es un documento que solo cada entidad expide. Queda como acción con responsable y fecha límite (domingo 1 de noviembre, 6:00 p. m.) en la tabla de decisiones del soporte inicial y en el correo</w:t>
+            </w:r>
+          </w:p>
+        </w:tc>
+        <w:tc>
+          <w:tcPr/>
+          <w:p>
+            <w:pPr>
+              <w:pStyle w:val="Compact"/>
+              <w:jc w:val="left"/>
+            </w:pPr>
+            <w:r>
+              <w:t xml:space="preserve">Acción externa con fecha</w:t>
             </w:r>
           </w:p>
         </w:tc>
@@ -663,31 +663,31 @@
               <w:jc w:val="left"/>
             </w:pPr>
             <w:r>
-              <w:t xml:space="preserve">Certificación del aporte en efectivo de Gestión y Medio Ambiente; sin ella el criterio 7 vuelve a cero</w:t>
-            </w:r>
-          </w:p>
-        </w:tc>
-        <w:tc>
-          <w:tcPr/>
-          <w:p>
-            <w:pPr>
-              <w:pStyle w:val="Compact"/>
-              <w:jc w:val="left"/>
-            </w:pPr>
-            <w:r>
-              <w:t xml:space="preserve">Secciones 26 y 28</w:t>
-            </w:r>
-          </w:p>
-        </w:tc>
-        <w:tc>
-          <w:tcPr/>
-          <w:p>
-            <w:pPr>
-              <w:pStyle w:val="Compact"/>
-              <w:jc w:val="left"/>
-            </w:pPr>
-            <w:r>
-              <w:t xml:space="preserve">Gestión y Medio Ambiente</w:t>
+              <w:t xml:space="preserve">Certificación del efectivo de Gestión y Medio Ambiente</w:t>
+            </w:r>
+          </w:p>
+        </w:tc>
+        <w:tc>
+          <w:tcPr/>
+          <w:p>
+            <w:pPr>
+              <w:pStyle w:val="Compact"/>
+              <w:jc w:val="left"/>
+            </w:pPr>
+            <w:r>
+              <w:t xml:space="preserve">Se entregan dos modelos de certificación de contrapartida listos para firmar (Gestión y Medio Ambiente: 110.000.000 en especie y 150.000.000 en efectivo; Avanciencia: 150.000.000 en especie), con código, actividad y momento del aporte</w:t>
+            </w:r>
+          </w:p>
+        </w:tc>
+        <w:tc>
+          <w:tcPr/>
+          <w:p>
+            <w:pPr>
+              <w:pStyle w:val="Compact"/>
+              <w:jc w:val="left"/>
+            </w:pPr>
+            <w:r>
+              <w:t xml:space="preserve">Modelo listo; falta la firma</w:t>
             </w:r>
           </w:p>
         </w:tc>
@@ -713,31 +713,31 @@
               <w:jc w:val="left"/>
             </w:pPr>
             <w:r>
-              <w:t xml:space="preserve">El bucle confianza → uso → recursos sigue siendo una inferencia sin fuente</w:t>
-            </w:r>
-          </w:p>
-        </w:tc>
-        <w:tc>
-          <w:tcPr/>
-          <w:p>
-            <w:pPr>
-              <w:pStyle w:val="Compact"/>
-              <w:jc w:val="left"/>
-            </w:pPr>
-            <w:r>
-              <w:t xml:space="preserve">Sección 5.4</w:t>
-            </w:r>
-          </w:p>
-        </w:tc>
-        <w:tc>
-          <w:tcPr/>
-          <w:p>
-            <w:pPr>
-              <w:pStyle w:val="Compact"/>
-              <w:jc w:val="left"/>
-            </w:pPr>
-            <w:r>
-              <w:t xml:space="preserve">Se conserva marcado como inferido</w:t>
+              <w:t xml:space="preserve">Bucle confianza → uso → recursos sin fuente</w:t>
+            </w:r>
+          </w:p>
+        </w:tc>
+        <w:tc>
+          <w:tcPr/>
+          <w:p>
+            <w:pPr>
+              <w:pStyle w:val="Compact"/>
+              <w:jc w:val="left"/>
+            </w:pPr>
+            <w:r>
+              <w:t xml:space="preserve">Cada tramo quedó respaldado: confianza en la utilidad → uso (Venkatesh et al., 2003); efectividad percibida y compromiso de los usuarios → financiación continuada (Shediac-Rizkallah y Bone, 1998). Su ocurrencia local sigue siendo inferencia, que la compuerta C1 contrasta. Sección 5.4</w:t>
+            </w:r>
+          </w:p>
+        </w:tc>
+        <w:tc>
+          <w:tcPr/>
+          <w:p>
+            <w:pPr>
+              <w:pStyle w:val="Compact"/>
+              <w:jc w:val="left"/>
+            </w:pPr>
+            <w:r>
+              <w:t xml:space="preserve">Cerrado</w:t>
             </w:r>
           </w:p>
         </w:tc>

</xml_diff>